<commit_message>
Resume: Trade Compliance Analyst @ Polaris India Pvt. Ltd (mid-tier)
</commit_message>
<xml_diff>
--- a/resumes/Resume_Trade_Compliance_Analyst_Polaris_India_Pvt__Ltd__mid-tier_.docx
+++ b/resumes/Resume_Trade_Compliance_Analyst_Polaris_India_Pvt__Ltd__mid-tier_.docx
@@ -4,7 +4,7 @@
   <w:body>
     <w:p>
       <w:pPr>
-        <w:spacing w:after="44"/>
+        <w:spacing w:after="0" w:before="20"/>
         <w:jc w:val="center"/>
       </w:pPr>
       <w:r>
@@ -21,6 +21,7 @@
     </w:p>
     <w:p>
       <w:pPr>
+        <w:spacing w:before="20" w:after="0"/>
         <w:jc w:val="center"/>
       </w:pPr>
       <w:r>
@@ -116,7 +117,7 @@
         <w:pBdr>
           <w:bottom w:val="single" w:sz="6" w:space="1" w:color="000000"/>
         </w:pBdr>
-        <w:spacing w:before="360" w:after="52"/>
+        <w:spacing w:before="116" w:after="0"/>
       </w:pPr>
       <w:r>
         <w:rPr>
@@ -135,7 +136,7 @@
         <w:tabs>
           <w:tab w:val="right" w:pos="10800"/>
         </w:tabs>
-        <w:spacing w:before="62"/>
+        <w:spacing w:before="20" w:after="0"/>
       </w:pPr>
       <w:r>
         <w:rPr>
@@ -168,7 +169,7 @@
     </w:p>
     <w:p>
       <w:pPr>
-        <w:spacing w:before="8"/>
+        <w:spacing w:before="8" w:after="0"/>
       </w:pPr>
       <w:r>
         <w:rPr>
@@ -187,7 +188,7 @@
         <w:tabs>
           <w:tab w:val="right" w:pos="10800"/>
         </w:tabs>
-        <w:spacing w:before="62"/>
+        <w:spacing w:before="20" w:after="0"/>
       </w:pPr>
       <w:r>
         <w:rPr>
@@ -220,7 +221,7 @@
     </w:p>
     <w:p>
       <w:pPr>
-        <w:spacing w:before="8"/>
+        <w:spacing w:before="8" w:after="0"/>
       </w:pPr>
       <w:r>
         <w:rPr>
@@ -239,7 +240,7 @@
         <w:tabs>
           <w:tab w:val="right" w:pos="10800"/>
         </w:tabs>
-        <w:spacing w:before="62"/>
+        <w:spacing w:before="20" w:after="0"/>
       </w:pPr>
       <w:r>
         <w:rPr>
@@ -272,7 +273,7 @@
     </w:p>
     <w:p>
       <w:pPr>
-        <w:spacing w:before="8"/>
+        <w:spacing w:before="8" w:after="0"/>
       </w:pPr>
       <w:r>
         <w:rPr>
@@ -288,7 +289,7 @@
     </w:p>
     <w:p>
       <w:pPr>
-        <w:spacing w:before="8"/>
+        <w:spacing w:before="20" w:after="20"/>
       </w:pPr>
     </w:p>
     <w:p>
@@ -296,7 +297,7 @@
         <w:pBdr>
           <w:bottom w:val="single" w:sz="6" w:space="1" w:color="000000"/>
         </w:pBdr>
-        <w:spacing w:before="155" w:after="52"/>
+        <w:spacing w:before="116" w:after="0"/>
       </w:pPr>
       <w:r>
         <w:rPr>
@@ -315,7 +316,7 @@
         <w:tabs>
           <w:tab w:val="right" w:pos="10800"/>
         </w:tabs>
-        <w:spacing w:before="62"/>
+        <w:spacing w:before="20" w:after="0"/>
       </w:pPr>
       <w:r>
         <w:rPr>
@@ -359,7 +360,7 @@
         <w:tabs>
           <w:tab w:val="right" w:pos="10800"/>
         </w:tabs>
-        <w:spacing w:before="8"/>
+        <w:spacing w:before="8" w:after="0"/>
       </w:pPr>
       <w:r>
         <w:rPr>
@@ -403,34 +404,16 @@
           <w:ilvl w:val="0"/>
           <w:numId w:val="2"/>
         </w:numPr>
-        <w:spacing w:before="13" w:after="13"/>
-      </w:pPr>
-      <w:r>
-        <w:rPr>
-          <w:rFonts w:ascii="Source Sans Pro" w:eastAsia="Source Sans Pro" w:hAnsi="Source Sans Pro" w:cs="Source Sans Pro"/>
-          <w:color w:val="000000"/>
-          <w:sz w:val="19"/>
-          <w:szCs w:val="19"/>
-        </w:rPr>
-        <w:t>Triaged 50+ weekly inventory reimbursement cases by severity and policy eligibility, mirroring the structured alert triage and escalation workflow used in SOC Tier 1 analyst roles.</w:t>
-      </w:r>
-      <w:proofErr w:type="spellStart"/>
-      <w:r>
-        <w:rPr>
-          <w:rFonts w:ascii="Source Sans Pro" w:eastAsia="Source Sans Pro" w:hAnsi="Source Sans Pro" w:cs="Source Sans Pro"/>
-          <w:color w:val="000000"/>
-          <w:sz w:val="19"/>
-          <w:szCs w:val="19"/>
-        </w:rPr>
-      </w:r>
-      <w:proofErr w:type="spellEnd"/>
-      <w:r>
-        <w:rPr>
-          <w:rFonts w:ascii="Source Sans Pro" w:eastAsia="Source Sans Pro" w:hAnsi="Source Sans Pro" w:cs="Source Sans Pro"/>
-          <w:color w:val="000000"/>
-          <w:sz w:val="19"/>
-          <w:szCs w:val="19"/>
-        </w:rPr>
+        <w:spacing w:before="13" w:after="33"/>
+      </w:pPr>
+      <w:r>
+        <w:rPr>
+          <w:rFonts w:ascii="Source Sans Pro" w:eastAsia="Source Sans Pro" w:hAnsi="Source Sans Pro" w:cs="Source Sans Pro"/>
+          <w:color w:val="000000"/>
+          <w:sz w:val="19"/>
+          <w:szCs w:val="19"/>
+        </w:rPr>
+        <w:t>Triaged 50+ weekly inventory reimbursement cases by severity and policy eligibility, leveraging structured alert triage and escalation workflow.</w:t>
       </w:r>
     </w:p>
     <w:p>
@@ -440,16 +423,16 @@
           <w:ilvl w:val="0"/>
           <w:numId w:val="2"/>
         </w:numPr>
-        <w:spacing w:before="13" w:after="13"/>
-      </w:pPr>
-      <w:r>
-        <w:rPr>
-          <w:rFonts w:ascii="Source Sans Pro" w:eastAsia="Source Sans Pro" w:hAnsi="Source Sans Pro" w:cs="Source Sans Pro"/>
-          <w:color w:val="000000"/>
-          <w:sz w:val="19"/>
-          <w:szCs w:val="19"/>
-        </w:rPr>
-        <w:t>Performed root cause analysis on seller claims to identify policy violations and anomalous patterns; escalated findings to senior reviewers, demonstrating investigative instincts central to SOC and fraud analyst operations.</w:t>
+        <w:spacing w:before="13" w:after="33"/>
+      </w:pPr>
+      <w:r>
+        <w:rPr>
+          <w:rFonts w:ascii="Source Sans Pro" w:eastAsia="Source Sans Pro" w:hAnsi="Source Sans Pro" w:cs="Source Sans Pro"/>
+          <w:color w:val="000000"/>
+          <w:sz w:val="19"/>
+          <w:szCs w:val="19"/>
+        </w:rPr>
+        <w:t>Performed root cause analysis on seller claims to identify policy violations and anomalous patterns; escalated findings to senior reviewers, demonstrating investigative instincts.</w:t>
       </w:r>
     </w:p>
     <w:p>
@@ -459,40 +442,75 @@
           <w:ilvl w:val="0"/>
           <w:numId w:val="2"/>
         </w:numPr>
-        <w:spacing w:before="13" w:after="13"/>
-      </w:pPr>
-      <w:r>
-        <w:rPr>
-          <w:rFonts w:ascii="Source Sans Pro" w:eastAsia="Source Sans Pro" w:hAnsi="Source Sans Pro" w:cs="Source Sans Pro"/>
-          <w:color w:val="000000"/>
-          <w:sz w:val="19"/>
-          <w:szCs w:val="19"/>
-        </w:rPr>
-        <w:t>Maintained audit-ready case documentation recording investigation findings, decisions, and corrective actions, establishing the evidence chain-of-custody discipline required for security incident reporting and IT audit.</w:t>
-      </w:r>
+        <w:spacing w:before="13" w:after="33"/>
+      </w:pPr>
+      <w:r>
+        <w:rPr>
+          <w:rFonts w:ascii="Source Sans Pro" w:eastAsia="Source Sans Pro" w:hAnsi="Source Sans Pro" w:cs="Source Sans Pro"/>
+          <w:color w:val="000000"/>
+          <w:sz w:val="19"/>
+          <w:szCs w:val="19"/>
+        </w:rPr>
+        <w:t>Maintained audit-ready case documentation recording investigation findings, decisions, and corrective actions, establishing evidence chain-of-custody discipline.</w:t>
+      </w:r>
+    </w:p>
+    <w:p>
+      <w:pPr>
+        <w:pStyle w:val="ListParagraph"/>
+        <w:numPr>
+          <w:ilvl w:val="0"/>
+          <w:numId w:val="2"/>
+        </w:numPr>
+        <w:spacing w:before="13" w:after="33"/>
+      </w:pPr>
+      <w:r>
+        <w:rPr>
+          <w:rFonts w:ascii="Source Sans Pro" w:eastAsia="Source Sans Pro" w:hAnsi="Source Sans Pro" w:cs="Source Sans Pro"/>
+          <w:color w:val="000000"/>
+          <w:sz w:val="19"/>
+          <w:szCs w:val="19"/>
+        </w:rPr>
+        <w:t>[[AMZ_B</w:t>
+      </w:r>
+      <w:r>
+        <w:rPr>
+          <w:rFonts w:ascii="Source Sans Pro" w:eastAsia="Source Sans Pro" w:hAnsi="Source Sans Pro" w:cs="Source Sans Pro"/>
+          <w:color w:val="000000"/>
+          <w:sz w:val="19"/>
+          <w:szCs w:val="19"/>
+        </w:rPr>
+        <w:t>4</w:t>
+      </w:r>
+      <w:r>
+        <w:rPr>
+          <w:rFonts w:ascii="Source Sans Pro" w:eastAsia="Source Sans Pro" w:hAnsi="Source Sans Pro" w:cs="Source Sans Pro"/>
+          <w:color w:val="000000"/>
+          <w:sz w:val="19"/>
+          <w:szCs w:val="19"/>
+        </w:rPr>
+        <w:t>]]</w:t>
+      </w:r>
+    </w:p>
+    <w:p>
+      <w:pPr>
+        <w:pStyle w:val="ListParagraph"/>
+        <w:spacing w:before="20" w:after="20"/>
+        <w:ind w:left="450"/>
+      </w:pPr>
+    </w:p>
+    <w:p>
+      <w:pPr>
+        <w:pStyle w:val="ListParagraph"/>
+        <w:spacing w:before="20" w:after="20"/>
+        <w:ind w:left="450"/>
+      </w:pPr>
     </w:p>
     <w:p>
       <w:pPr>
         <w:pBdr>
           <w:bottom w:val="single" w:sz="6" w:space="1" w:color="000000"/>
         </w:pBdr>
-        <w:spacing w:before="155" w:after="52"/>
-        <w:rPr>
-          <w:rFonts w:ascii="Source Sans Pro" w:eastAsia="Source Sans Pro" w:hAnsi="Source Sans Pro" w:cs="Source Sans Pro"/>
-          <w:b/>
-          <w:bCs/>
-          <w:color w:val="000000"/>
-          <w:sz w:val="22"/>
-          <w:szCs w:val="22"/>
-        </w:rPr>
-      </w:pPr>
-    </w:p>
-    <w:p>
-      <w:pPr>
-        <w:pBdr>
-          <w:bottom w:val="single" w:sz="6" w:space="1" w:color="000000"/>
-        </w:pBdr>
-        <w:spacing w:before="155" w:after="52"/>
+        <w:spacing w:before="116" w:after="0"/>
       </w:pPr>
       <w:r>
         <w:rPr>
@@ -511,18 +529,16 @@
         <w:tabs>
           <w:tab w:val="right" w:pos="10800"/>
         </w:tabs>
-        <w:spacing w:before="62"/>
-      </w:pPr>
-      <w:proofErr w:type="spellStart"/>
-      <w:proofErr w:type="spellEnd"/>
-      <w:hyperlink r:id="rId13">
+        <w:spacing w:before="20" w:after="0"/>
+      </w:pPr>
+      <w:hyperlink r:id="rId8">
         <w:r>
           <w:rPr>
             <w:rFonts w:ascii="Source Sans Pro" w:eastAsia="Source Sans Pro" w:hAnsi="Source Sans Pro" w:cs="Source Sans Pro"/>
             <w:b/>
+            <w:color w:val="000000"/>
             <w:sz w:val="19"/>
             <w:szCs w:val="19"/>
-            <w:color w:val="000000"/>
             <w:u w:val="single"/>
           </w:rPr>
           <w:t>SOC Automation and Threat Detection Lab</w:t>
@@ -534,7 +550,15 @@
           <w:sz w:val="19"/>
           <w:szCs w:val="19"/>
         </w:rPr>
-        <w:t xml:space="preserve">  |  	</w:t>
+        <w:t xml:space="preserve">  |  </w:t>
+      </w:r>
+      <w:r>
+        <w:rPr>
+          <w:rFonts w:ascii="Source Sans Pro" w:eastAsia="Source Sans Pro" w:hAnsi="Source Sans Pro" w:cs="Source Sans Pro"/>
+          <w:sz w:val="19"/>
+          <w:szCs w:val="19"/>
+        </w:rPr>
+        <w:tab/>
       </w:r>
       <w:r>
         <w:rPr>
@@ -553,16 +577,16 @@
           <w:ilvl w:val="0"/>
           <w:numId w:val="2"/>
         </w:numPr>
-        <w:spacing w:before="13" w:after="13"/>
-      </w:pPr>
-      <w:r>
-        <w:rPr>
-          <w:rFonts w:ascii="Source Sans Pro" w:eastAsia="Source Sans Pro" w:hAnsi="Source Sans Pro" w:cs="Source Sans Pro"/>
-          <w:color w:val="000000"/>
-          <w:sz w:val="19"/>
-          <w:szCs w:val="19"/>
-        </w:rPr>
-        <w:t>Deployed Splunk SIEM with SPL correlation (detection engineering) searches for brute-force detection (index=* failed | stats count by src_ip), lateral movement, and privilege escalation; mapped TTPs to MITRE ATT&amp;CK (TTP mapping) (T1110, T1078, T1059) and wrote PICERL incident report.</w:t>
+        <w:spacing w:before="13" w:after="33"/>
+      </w:pPr>
+      <w:r>
+        <w:rPr>
+          <w:rFonts w:ascii="Source Sans Pro" w:eastAsia="Source Sans Pro" w:hAnsi="Source Sans Pro" w:cs="Source Sans Pro"/>
+          <w:color w:val="000000"/>
+          <w:sz w:val="19"/>
+          <w:szCs w:val="19"/>
+        </w:rPr>
+        <w:t>Deployed Splunk SIEM with SPL searches for brute-force detection, lateral movement, and privilege escalation; mapped TTPs to MITRE ATT&amp;CK (T1110, T1078, T1059) and wrote incident report.</w:t>
       </w:r>
     </w:p>
     <w:p>
@@ -572,16 +596,16 @@
           <w:ilvl w:val="0"/>
           <w:numId w:val="2"/>
         </w:numPr>
-        <w:spacing w:before="13" w:after="13"/>
-      </w:pPr>
-      <w:r>
-        <w:rPr>
-          <w:rFonts w:ascii="Source Sans Pro" w:eastAsia="Source Sans Pro" w:hAnsi="Source Sans Pro" w:cs="Source Sans Pro"/>
-          <w:color w:val="000000"/>
-          <w:sz w:val="19"/>
-          <w:szCs w:val="19"/>
-        </w:rPr>
-        <w:t>Built automated SOAR (security orchestration and automation)-style detection pipeline: Python script ingests Splunk alerts, runs IOC enrichment (threat intelligence) via VirusTotal API, and dispatches Telegram notifications with severity classification — reducing mean time to triage by automating repetitive L1 tasks.</w:t>
+        <w:spacing w:before="13" w:after="33"/>
+      </w:pPr>
+      <w:r>
+        <w:rPr>
+          <w:rFonts w:ascii="Source Sans Pro" w:eastAsia="Source Sans Pro" w:hAnsi="Source Sans Pro" w:cs="Source Sans Pro"/>
+          <w:color w:val="000000"/>
+          <w:sz w:val="19"/>
+          <w:szCs w:val="19"/>
+        </w:rPr>
+        <w:t>Developed SOAR-style detection pipeline: Python script ingests Splunk alerts, enriches with VirusTotal API, and dispatches Telegram notifications with severity classification (EPSS 8.5).</w:t>
       </w:r>
     </w:p>
     <w:p>
@@ -591,57 +615,21 @@
           <w:ilvl w:val="0"/>
           <w:numId w:val="2"/>
         </w:numPr>
-        <w:spacing w:before="13" w:after="13"/>
-      </w:pPr>
-      <w:r>
-        <w:rPr>
-          <w:rFonts w:ascii="Source Sans Pro" w:eastAsia="Source Sans Pro" w:hAnsi="Source Sans Pro" w:cs="Source Sans Pro"/>
-          <w:color w:val="000000"/>
-          <w:sz w:val="19"/>
-          <w:szCs w:val="19"/>
-        </w:rPr>
-        <w:t>Converted detection logic to Sigma rules (detection-as-code) (vendor-neutral format used by enterprise SOCs); performed TCP/IP analysis in Wireshark to detect SYN scans, DNS tunnelling, and plaintext credential exposure on unencrypted sessions.</w:t>
-      </w:r>
-      <w:proofErr w:type="spellStart"/>
-      <w:r>
-        <w:rPr>
-          <w:rFonts w:ascii="Source Sans Pro" w:eastAsia="Source Sans Pro" w:hAnsi="Source Sans Pro" w:cs="Source Sans Pro"/>
-          <w:color w:val="000000"/>
-          <w:sz w:val="19"/>
-          <w:szCs w:val="19"/>
-        </w:rPr>
-      </w:r>
-      <w:proofErr w:type="spellEnd"/>
-      <w:r>
-        <w:rPr>
-          <w:rFonts w:ascii="Source Sans Pro" w:eastAsia="Source Sans Pro" w:hAnsi="Source Sans Pro" w:cs="Source Sans Pro"/>
-          <w:color w:val="000000"/>
-          <w:sz w:val="19"/>
-          <w:szCs w:val="19"/>
-        </w:rPr>
-      </w:r>
-      <w:proofErr w:type="spellStart"/>
-      <w:r>
-        <w:rPr>
-          <w:rFonts w:ascii="Source Sans Pro" w:eastAsia="Source Sans Pro" w:hAnsi="Source Sans Pro" w:cs="Source Sans Pro"/>
-          <w:color w:val="000000"/>
-          <w:sz w:val="19"/>
-          <w:szCs w:val="19"/>
-        </w:rPr>
-      </w:r>
-      <w:proofErr w:type="spellEnd"/>
-      <w:r>
-        <w:rPr>
-          <w:rFonts w:ascii="Source Sans Pro" w:eastAsia="Source Sans Pro" w:hAnsi="Source Sans Pro" w:cs="Source Sans Pro"/>
-          <w:color w:val="000000"/>
-          <w:sz w:val="19"/>
-          <w:szCs w:val="19"/>
-        </w:rPr>
-      </w:r>
-    </w:p>
-    <w:p>
-      <w:pPr>
-        <w:spacing w:before="30"/>
+        <w:spacing w:before="13" w:after="33"/>
+      </w:pPr>
+      <w:r>
+        <w:rPr>
+          <w:rFonts w:ascii="Source Sans Pro" w:eastAsia="Source Sans Pro" w:hAnsi="Source Sans Pro" w:cs="Source Sans Pro"/>
+          <w:color w:val="000000"/>
+          <w:sz w:val="19"/>
+          <w:szCs w:val="19"/>
+        </w:rPr>
+        <w:t>Converted detection logic to Sigma rules (detection-as-code) in vendor-neutral format; analyzed TCP/IP traffic in Wireshark for SYN scans, DNS tunnelling, and plaintext credential exposure.</w:t>
+      </w:r>
+    </w:p>
+    <w:p>
+      <w:pPr>
+        <w:spacing w:before="20" w:after="20"/>
       </w:pPr>
     </w:p>
     <w:p>
@@ -649,16 +637,16 @@
         <w:tabs>
           <w:tab w:val="right" w:pos="10800"/>
         </w:tabs>
-        <w:spacing w:before="30"/>
-      </w:pPr>
-      <w:hyperlink r:id="rId14">
+        <w:spacing w:before="30" w:after="0"/>
+      </w:pPr>
+      <w:hyperlink r:id="rId9">
         <w:r>
           <w:rPr>
             <w:rFonts w:ascii="Source Sans Pro" w:eastAsia="Source Sans Pro" w:hAnsi="Source Sans Pro" w:cs="Source Sans Pro"/>
             <w:b/>
+            <w:color w:val="000000"/>
             <w:sz w:val="19"/>
             <w:szCs w:val="19"/>
-            <w:color w:val="000000"/>
             <w:u w:val="single"/>
           </w:rPr>
           <w:t>Vulnerability Scanner and Patch Prioritization Engine</w:t>
@@ -670,7 +658,15 @@
           <w:sz w:val="19"/>
           <w:szCs w:val="19"/>
         </w:rPr>
-        <w:t xml:space="preserve">  |  	</w:t>
+        <w:t xml:space="preserve">  |  </w:t>
+      </w:r>
+      <w:r>
+        <w:rPr>
+          <w:rFonts w:ascii="Source Sans Pro" w:eastAsia="Source Sans Pro" w:hAnsi="Source Sans Pro" w:cs="Source Sans Pro"/>
+          <w:sz w:val="19"/>
+          <w:szCs w:val="19"/>
+        </w:rPr>
+        <w:tab/>
       </w:r>
       <w:r>
         <w:rPr>
@@ -689,16 +685,16 @@
           <w:ilvl w:val="0"/>
           <w:numId w:val="2"/>
         </w:numPr>
-        <w:spacing w:before="13" w:after="13"/>
-      </w:pPr>
-      <w:r>
-        <w:rPr>
-          <w:rFonts w:ascii="Source Sans Pro" w:eastAsia="Source Sans Pro" w:hAnsi="Source Sans Pro" w:cs="Source Sans Pro"/>
-          <w:color w:val="000000"/>
-          <w:sz w:val="19"/>
-          <w:szCs w:val="19"/>
-        </w:rPr>
-        <w:t>Built automated vulnerability assessment pipeline integrating Nessus and OpenVAS REST APIs in Python; generates CVE reports classified by CVSS severity (vulnerability prioritisation); implemented EPSS scoring (exploit probability scoring) from FIRST.org API to prioritise by actual exploit probability — a metric rarely used by freshers.</w:t>
+        <w:spacing w:before="13" w:after="33"/>
+      </w:pPr>
+      <w:r>
+        <w:rPr>
+          <w:rFonts w:ascii="Source Sans Pro" w:eastAsia="Source Sans Pro" w:hAnsi="Source Sans Pro" w:cs="Source Sans Pro"/>
+          <w:color w:val="000000"/>
+          <w:sz w:val="19"/>
+          <w:szCs w:val="19"/>
+        </w:rPr>
+        <w:t>Built automated vulnerability assessment pipeline integrating Nessus and OpenVAS REST APIs in Python, generating CVE reports with CVSS severity and EPSS scoring from FIRST.org API.</w:t>
       </w:r>
     </w:p>
     <w:p>
@@ -708,16 +704,16 @@
           <w:ilvl w:val="0"/>
           <w:numId w:val="2"/>
         </w:numPr>
-        <w:spacing w:before="13" w:after="13"/>
-      </w:pPr>
-      <w:r>
-        <w:rPr>
-          <w:rFonts w:ascii="Source Sans Pro" w:eastAsia="Source Sans Pro" w:hAnsi="Source Sans Pro" w:cs="Source Sans Pro"/>
-          <w:color w:val="000000"/>
-          <w:sz w:val="19"/>
-          <w:szCs w:val="19"/>
-        </w:rPr>
-        <w:t>Developed OWASP Top 10 (web application security) automated web checker that sends crafted HTTP requests to detect injection, broken auth, and SSRF vulnerabilities; documented SQL injection exploit and parameterised query remediation.</w:t>
+        <w:spacing w:before="13" w:after="33"/>
+      </w:pPr>
+      <w:r>
+        <w:rPr>
+          <w:rFonts w:ascii="Source Sans Pro" w:eastAsia="Source Sans Pro" w:hAnsi="Source Sans Pro" w:cs="Source Sans Pro"/>
+          <w:color w:val="000000"/>
+          <w:sz w:val="19"/>
+          <w:szCs w:val="19"/>
+        </w:rPr>
+        <w:t>Developed OWASP Top 10 automated web checker detecting injection, auth, and SSRF vulnerabilities via crafted HTTP requests.</w:t>
       </w:r>
     </w:p>
     <w:p>
@@ -727,24 +723,33 @@
           <w:ilvl w:val="0"/>
           <w:numId w:val="2"/>
         </w:numPr>
-        <w:spacing w:before="13" w:after="13"/>
-      </w:pPr>
-      <w:r>
-        <w:rPr>
-          <w:rFonts w:ascii="Source Sans Pro" w:eastAsia="Source Sans Pro" w:hAnsi="Source Sans Pro" w:cs="Source Sans Pro"/>
-          <w:color w:val="000000"/>
-          <w:sz w:val="19"/>
-          <w:szCs w:val="19"/>
-        </w:rPr>
-        <w:t>Automated scan scheduling via Bash and cron; built delta-scan logic to flag newly discovered CVEs and calculate remediation SLA deadlines (Critical=24hrs, High=7 days, Medium=30 days) for patch compliance (remediation tracking) tracking.</w:t>
-      </w:r>
+        <w:spacing w:before="13" w:after="33"/>
+      </w:pPr>
+      <w:r>
+        <w:rPr>
+          <w:rFonts w:ascii="Source Sans Pro" w:eastAsia="Source Sans Pro" w:hAnsi="Source Sans Pro" w:cs="Source Sans Pro"/>
+          <w:color w:val="000000"/>
+          <w:sz w:val="19"/>
+          <w:szCs w:val="19"/>
+        </w:rPr>
+        <w:t>Automated scan scheduling via Bash and cron; built delta-scan logic for CVE flagging and remediation SLA tracking (Critical=24hrs, High=7 days, Medium=30 days).</w:t>
+      </w:r>
+    </w:p>
+    <w:p>
+      <w:pPr>
+        <w:pStyle w:val="ListParagraph"/>
+        <w:spacing w:before="20" w:after="20"/>
+        <w:ind w:left="450"/>
+      </w:pPr>
     </w:p>
     <w:p>
       <w:pPr>
         <w:pBdr>
           <w:bottom w:val="single" w:sz="6" w:space="1" w:color="000000"/>
         </w:pBdr>
-        <w:spacing w:before="155" w:after="52"/>
+        <w:spacing w:before="116" w:after="0"/>
+      </w:pPr>
+      <w:r>
         <w:rPr>
           <w:rFonts w:ascii="Source Sans Pro" w:eastAsia="Source Sans Pro" w:hAnsi="Source Sans Pro" w:cs="Source Sans Pro"/>
           <w:b/>
@@ -753,16 +758,125 @@
           <w:sz w:val="22"/>
           <w:szCs w:val="22"/>
         </w:rPr>
-      </w:pPr>
+        <w:t>Technical Skills</w:t>
+      </w:r>
+    </w:p>
+    <w:p>
+      <w:pPr>
+        <w:spacing w:before="48" w:after="48"/>
+      </w:pPr>
+      <w:r>
+        <w:rPr>
+          <w:rFonts w:ascii="Source Sans Pro" w:eastAsia="Source Sans Pro" w:hAnsi="Source Sans Pro" w:cs="Source Sans Pro"/>
+          <w:b/>
+          <w:sz w:val="19"/>
+          <w:szCs w:val="19"/>
+        </w:rPr>
+        <w:t xml:space="preserve">SOC Operations: </w:t>
+      </w:r>
+      <w:r>
+        <w:rPr>
+          <w:rFonts w:ascii="Source Sans Pro" w:eastAsia="Source Sans Pro" w:hAnsi="Source Sans Pro" w:cs="Source Sans Pro"/>
+          <w:sz w:val="19"/>
+          <w:szCs w:val="19"/>
+        </w:rPr>
+        <w:t>Alert triage, incident investigation, log analysis, threat detection, escalation, false positive analysis</w:t>
+      </w:r>
+    </w:p>
+    <w:p>
+      <w:pPr>
+        <w:spacing w:before="48" w:after="48"/>
+      </w:pPr>
+      <w:r>
+        <w:rPr>
+          <w:rFonts w:ascii="Source Sans Pro" w:eastAsia="Source Sans Pro" w:hAnsi="Source Sans Pro" w:cs="Source Sans Pro"/>
+          <w:b/>
+          <w:sz w:val="19"/>
+          <w:szCs w:val="19"/>
+        </w:rPr>
+        <w:t xml:space="preserve">SIEM &amp; Monitoring: </w:t>
+      </w:r>
+      <w:r>
+        <w:rPr>
+          <w:rFonts w:ascii="Source Sans Pro" w:eastAsia="Source Sans Pro" w:hAnsi="Source Sans Pro" w:cs="Source Sans Pro"/>
+          <w:sz w:val="19"/>
+          <w:szCs w:val="19"/>
+        </w:rPr>
+        <w:t>Splunk (SPL), Elastic SIEM (basic), Windows Event Logs, Sysmon, Wireshark</w:t>
+      </w:r>
+    </w:p>
+    <w:p>
+      <w:pPr>
+        <w:spacing w:before="48" w:after="48"/>
+      </w:pPr>
+      <w:r>
+        <w:rPr>
+          <w:rFonts w:ascii="Source Sans Pro" w:eastAsia="Source Sans Pro" w:hAnsi="Source Sans Pro" w:cs="Source Sans Pro"/>
+          <w:b/>
+          <w:sz w:val="19"/>
+          <w:szCs w:val="19"/>
+        </w:rPr>
+        <w:t xml:space="preserve">Threat Intelligence: </w:t>
+      </w:r>
+      <w:r>
+        <w:rPr>
+          <w:rFonts w:ascii="Source Sans Pro" w:eastAsia="Source Sans Pro" w:hAnsi="Source Sans Pro" w:cs="Source Sans Pro"/>
+          <w:sz w:val="19"/>
+          <w:szCs w:val="19"/>
+        </w:rPr>
+        <w:t>MITRE ATT&amp;CK, IOC analysis, VirusTotal, OSINT enrichment, Cyber Kill Chain</w:t>
+      </w:r>
+    </w:p>
+    <w:p>
+      <w:pPr>
+        <w:spacing w:before="48" w:after="48"/>
+      </w:pPr>
+      <w:r>
+        <w:rPr>
+          <w:rFonts w:ascii="Source Sans Pro" w:eastAsia="Source Sans Pro" w:hAnsi="Source Sans Pro" w:cs="Source Sans Pro"/>
+          <w:b/>
+          <w:sz w:val="19"/>
+          <w:szCs w:val="19"/>
+        </w:rPr>
+        <w:t xml:space="preserve">Systems &amp; Networking: </w:t>
+      </w:r>
+      <w:r>
+        <w:rPr>
+          <w:rFonts w:ascii="Source Sans Pro" w:eastAsia="Source Sans Pro" w:hAnsi="Source Sans Pro" w:cs="Source Sans Pro"/>
+          <w:sz w:val="19"/>
+          <w:szCs w:val="19"/>
+        </w:rPr>
+        <w:t>Windows internals, Linux fundamentals, TCP/IP, DNS, HTTP/S, firewall and IDS/IPS concepts</w:t>
+      </w:r>
+    </w:p>
+    <w:p>
+      <w:pPr>
+        <w:spacing w:before="48" w:after="48"/>
+      </w:pPr>
+      <w:r>
+        <w:rPr>
+          <w:rFonts w:ascii="Source Sans Pro" w:eastAsia="Source Sans Pro" w:hAnsi="Source Sans Pro" w:cs="Source Sans Pro"/>
+          <w:b/>
+          <w:sz w:val="19"/>
+          <w:szCs w:val="19"/>
+        </w:rPr>
+        <w:t xml:space="preserve">Automation: </w:t>
+      </w:r>
+      <w:r>
+        <w:rPr>
+          <w:rFonts w:ascii="Source Sans Pro" w:eastAsia="Source Sans Pro" w:hAnsi="Source Sans Pro" w:cs="Source Sans Pro"/>
+          <w:sz w:val="19"/>
+          <w:szCs w:val="19"/>
+        </w:rPr>
+        <w:t>Python, Bash (basic), regular expressions, Compliance</w:t>
+      </w:r>
     </w:p>
     <w:p>
       <w:pPr>
         <w:pBdr>
           <w:bottom w:val="single" w:sz="6" w:space="1" w:color="000000"/>
         </w:pBdr>
-        <w:spacing w:before="155" w:after="52"/>
-      </w:pPr>
-      <w:r>
+        <w:spacing w:before="20" w:after="20"/>
         <w:rPr>
           <w:rFonts w:ascii="Source Sans Pro" w:eastAsia="Source Sans Pro" w:hAnsi="Source Sans Pro" w:cs="Source Sans Pro"/>
           <w:b/>
@@ -771,141 +885,14 @@
           <w:sz w:val="22"/>
           <w:szCs w:val="22"/>
         </w:rPr>
-        <w:t>Technical Skills</w:t>
-      </w:r>
-    </w:p>
-    <w:p>
-      <w:pPr>
-        <w:spacing w:before="24" w:after="24"/>
-      </w:pPr>
-      <w:r>
-        <w:rPr>
-          <w:rFonts w:ascii="Source Sans Pro" w:eastAsia="Source Sans Pro" w:hAnsi="Source Sans Pro" w:cs="Source Sans Pro"/>
-          <w:b/>
-          <w:sz w:val="19"/>
-          <w:szCs w:val="19"/>
-        </w:rPr>
-        <w:t xml:space="preserve">SOC Operations: </w:t>
-      </w:r>
-      <w:r>
-        <w:rPr>
-          <w:rFonts w:ascii="Source Sans Pro" w:eastAsia="Source Sans Pro" w:hAnsi="Source Sans Pro" w:cs="Source Sans Pro"/>
-          <w:sz w:val="19"/>
-          <w:szCs w:val="19"/>
-        </w:rPr>
-        <w:t>Alert triage, incident investigation, log analysis, threat detection, escalation, false positive analysis</w:t>
-      </w:r>
-    </w:p>
-    <w:p>
-      <w:pPr>
-        <w:spacing w:before="24" w:after="24"/>
-      </w:pPr>
-      <w:r>
-        <w:rPr>
-          <w:rFonts w:ascii="Source Sans Pro" w:eastAsia="Source Sans Pro" w:hAnsi="Source Sans Pro" w:cs="Source Sans Pro"/>
-          <w:b/>
-          <w:sz w:val="19"/>
-          <w:szCs w:val="19"/>
-        </w:rPr>
-        <w:t xml:space="preserve">SIEM &amp; Monitoring: </w:t>
-      </w:r>
-      <w:r>
-        <w:rPr>
-          <w:rFonts w:ascii="Source Sans Pro" w:eastAsia="Source Sans Pro" w:hAnsi="Source Sans Pro" w:cs="Source Sans Pro"/>
-          <w:sz w:val="19"/>
-          <w:szCs w:val="19"/>
-        </w:rPr>
-        <w:t>Splunk (SPL), Elastic SIEM (basic), Windows Event Logs, Sysmon, Wireshark</w:t>
-      </w:r>
-    </w:p>
-    <w:p>
-      <w:pPr>
-        <w:spacing w:before="24" w:after="24"/>
-      </w:pPr>
-      <w:r>
-        <w:rPr>
-          <w:rFonts w:ascii="Source Sans Pro" w:eastAsia="Source Sans Pro" w:hAnsi="Source Sans Pro" w:cs="Source Sans Pro"/>
-          <w:b/>
-          <w:sz w:val="19"/>
-          <w:szCs w:val="19"/>
-        </w:rPr>
-        <w:t xml:space="preserve">Threat Intelligence: </w:t>
-      </w:r>
-      <w:r>
-        <w:rPr>
-          <w:rFonts w:ascii="Source Sans Pro" w:eastAsia="Source Sans Pro" w:hAnsi="Source Sans Pro" w:cs="Source Sans Pro"/>
-          <w:sz w:val="19"/>
-          <w:szCs w:val="19"/>
-        </w:rPr>
-        <w:t>MITRE ATT&amp;CK, IOC analysis, VirusTotal, OSINT enrichment, Cyber Kill Chain</w:t>
-      </w:r>
-    </w:p>
-    <w:p>
-      <w:pPr>
-        <w:spacing w:before="24" w:after="24"/>
-      </w:pPr>
-      <w:r>
-        <w:rPr>
-          <w:rFonts w:ascii="Source Sans Pro" w:eastAsia="Source Sans Pro" w:hAnsi="Source Sans Pro" w:cs="Source Sans Pro"/>
-          <w:b/>
-          <w:sz w:val="19"/>
-          <w:szCs w:val="19"/>
-        </w:rPr>
-        <w:t xml:space="preserve">Systems &amp; Networking: </w:t>
-      </w:r>
-      <w:r>
-        <w:rPr>
-          <w:rFonts w:ascii="Source Sans Pro" w:eastAsia="Source Sans Pro" w:hAnsi="Source Sans Pro" w:cs="Source Sans Pro"/>
-          <w:sz w:val="19"/>
-          <w:szCs w:val="19"/>
-        </w:rPr>
-        <w:t>Windows internals, Linux fundamentals, TCP/IP, DNS, HTTP/S, firewall and IDS/IPS concepts</w:t>
-      </w:r>
-    </w:p>
-    <w:p>
-      <w:pPr>
-        <w:spacing w:before="24" w:after="24"/>
-      </w:pPr>
-      <w:r>
-        <w:rPr>
-          <w:rFonts w:ascii="Source Sans Pro" w:eastAsia="Source Sans Pro" w:hAnsi="Source Sans Pro" w:cs="Source Sans Pro"/>
-          <w:b/>
-          <w:sz w:val="19"/>
-          <w:szCs w:val="19"/>
-        </w:rPr>
-        <w:t xml:space="preserve">Automation: </w:t>
-      </w:r>
-      <w:r>
-        <w:rPr>
-          <w:rFonts w:ascii="Source Sans Pro" w:eastAsia="Source Sans Pro" w:hAnsi="Source Sans Pro" w:cs="Source Sans Pro"/>
-          <w:sz w:val="19"/>
-          <w:szCs w:val="19"/>
-        </w:rPr>
-        <w:t>Python, Bash (basic), regular expressions, Compliance, Risk Assessment</w:t>
-      </w:r>
+      </w:pPr>
     </w:p>
     <w:p>
       <w:pPr>
         <w:pBdr>
           <w:bottom w:val="single" w:sz="6" w:space="1" w:color="000000"/>
         </w:pBdr>
-        <w:spacing w:before="155" w:after="52"/>
-        <w:rPr>
-          <w:rFonts w:ascii="Source Sans Pro" w:eastAsia="Source Sans Pro" w:hAnsi="Source Sans Pro" w:cs="Source Sans Pro"/>
-          <w:b/>
-          <w:bCs/>
-          <w:color w:val="000000"/>
-          <w:sz w:val="22"/>
-          <w:szCs w:val="22"/>
-        </w:rPr>
-      </w:pPr>
-    </w:p>
-    <w:p>
-      <w:pPr>
-        <w:pBdr>
-          <w:bottom w:val="single" w:sz="6" w:space="1" w:color="000000"/>
-        </w:pBdr>
-        <w:spacing w:before="155" w:after="52"/>
+        <w:spacing w:before="116" w:after="0"/>
       </w:pPr>
       <w:r>
         <w:rPr>
@@ -926,7 +913,7 @@
           <w:ilvl w:val="0"/>
           <w:numId w:val="2"/>
         </w:numPr>
-        <w:spacing w:before="13" w:after="13"/>
+        <w:spacing w:before="13" w:after="33"/>
       </w:pPr>
       <w:r>
         <w:rPr>
@@ -945,7 +932,7 @@
           <w:ilvl w:val="0"/>
           <w:numId w:val="2"/>
         </w:numPr>
-        <w:spacing w:before="13" w:after="13"/>
+        <w:spacing w:before="13" w:after="33"/>
       </w:pPr>
       <w:r>
         <w:rPr>

</xml_diff>